<commit_message>
Add strategic backup section (overseas M&A, non-insurance ecosystem, asset management) to script v3
Co-Authored-By: Claude Fable 5 <noreply@anthropic.com>
Claude-Session: https://claude.ai/code/session_01YGzA3WbaeUwMCybbhbMuHW
</commit_message>
<xml_diff>
--- a/工作會報講稿v3_對應交人資版v2.docx
+++ b/工作會報講稿v3_對應交人資版v2.docx
@@ -163,6 +163,24 @@
     </w:p>
     <w:p>
       <w:pPr>
+        <w:pStyle w:val="ListParagraph"/>
+        <w:numPr>
+          <w:ilvl w:val="0"/>
+          <w:numId w:val="2"/>
+        </w:numPr>
+        <w:spacing w:after="80"/>
+      </w:pPr>
+      <w:r>
+        <w:rPr>
+          <w:rFonts w:ascii="Microsoft JhengHei" w:cs="Microsoft JhengHei" w:eastAsia="Microsoft JhengHei" w:hAnsi="Microsoft JhengHei"/>
+          <w:sz w:val="22"/>
+          <w:szCs w:val="22"/>
+        </w:rPr>
+        <w:t xml:space="preserve">文末新增「全場戰略類備援」（海外購併／非保險生態圈／保險×資管），對應被問「為了未來 30 年，只做這些夠嗎」。</w:t>
+      </w:r>
+    </w:p>
+    <w:p>
+      <w:pPr>
         <w:spacing w:after="120" w:before="280"/>
       </w:pPr>
       <w:r>
@@ -2344,6 +2362,146 @@
           <w:szCs w:val="22"/>
         </w:rPr>
         <w:t xml:space="preserve">台灣現況：已有本人查詢與身故後繼承人查詢（壽險公會投保紀錄查詢・保險存摺）；待補「失智/判斷能力低下時」的家屬照會與請領銜接。KPI 建議：失聯契約率／代理權有效率／通知到給付天數。</w:t>
+      </w:r>
+    </w:p>
+    <w:p>
+      <w:pPr>
+        <w:spacing w:after="120" w:before="280"/>
+      </w:pPr>
+      <w:r>
+        <w:rPr>
+          <w:rFonts w:ascii="Microsoft JhengHei" w:cs="Microsoft JhengHei" w:eastAsia="Microsoft JhengHei" w:hAnsi="Microsoft JhengHei"/>
+          <w:b/>
+          <w:bCs/>
+          <w:sz w:val="24"/>
+          <w:szCs w:val="24"/>
+        </w:rPr>
+        <w:t xml:space="preserve">全場戰略類備援（頁面未載，被問「30 年只做這些夠嗎」才講）</w:t>
+      </w:r>
+    </w:p>
+    <w:p>
+      <w:pPr>
+        <w:spacing w:after="120"/>
+      </w:pPr>
+      <w:r>
+        <w:rPr>
+          <w:rFonts w:ascii="Microsoft JhengHei" w:cs="Microsoft JhengHei" w:eastAsia="Microsoft JhengHei" w:hAnsi="Microsoft JhengHei"/>
+          <w:sz w:val="22"/>
+          <w:szCs w:val="22"/>
+        </w:rPr>
+        <w:t xml:space="preserve">開口句：本簡報刻意聚焦「高齡市場裡怎麼賺錢」；日本業界為 30 年尺度的完整答案其實是三個市場——高齡市場（本簡報）、海外市場（買成長）、企業與資管市場（買接點、買能力）。後兩條的量級比簡報裡的 2,100 億円大一個數量級。</w:t>
+      </w:r>
+    </w:p>
+    <w:p>
+      <w:pPr>
+        <w:pStyle w:val="ListParagraph"/>
+        <w:numPr>
+          <w:ilvl w:val="0"/>
+          <w:numId w:val="2"/>
+        </w:numPr>
+        <w:spacing w:after="80"/>
+      </w:pPr>
+      <w:r>
+        <w:rPr>
+          <w:rFonts w:ascii="Microsoft JhengHei" w:cs="Microsoft JhengHei" w:eastAsia="Microsoft JhengHei" w:hAnsi="Microsoft JhengHei"/>
+          <w:b/>
+          <w:bCs/>
+          <w:sz w:val="22"/>
+          <w:szCs w:val="22"/>
+        </w:rPr>
+        <w:t xml:space="preserve">海外購併＝把資產負債表搬到人口還在成長的地方</w:t>
+      </w:r>
+      <w:r>
+        <w:rPr>
+          <w:rFonts w:ascii="Microsoft JhengHei" w:cs="Microsoft JhengHei" w:eastAsia="Microsoft JhengHei" w:hAnsi="Microsoft JhengHei"/>
+          <w:sz w:val="22"/>
+          <w:szCs w:val="22"/>
+        </w:rPr>
+        <w:t xml:space="preserve">：四大手全部下場、近兩年加速。日生——Resolution Life 約 82 億美元（約 1.2 兆円）完全子會社化（2024/12 宣布、2025/10/31 完成），同步對美國 Corebridge 出資 5,800 億円取得 21%，並整合澳洲 MLC；背景是日生 FY2023 基礎利益 7,640 億円中海外僅約 4%，因此設 2 兆円投資枠。明治安田——2016 年 StanCorp（美國團體保險基盤）＋2025/2 以約 3,522 億円收購英國 L&amp;G 美國個人保險與 PRT 事業（Banner Life，2026/2 完成交割）＋L&amp;G 戰略提攜。住友——Singlife 累計約 4,200 億円、2024/3 完全子會社化，海外利益目標 1,000 億円。第一——2015 年買 Protective 為先行者。兩種結構對照：先買基盤再 bolt-on（明治安田型）vs 一次買大（日生型）。金額均為公司或媒體公開發布值。</w:t>
+      </w:r>
+    </w:p>
+    <w:p>
+      <w:pPr>
+        <w:pStyle w:val="ListParagraph"/>
+        <w:numPr>
+          <w:ilvl w:val="0"/>
+          <w:numId w:val="2"/>
+        </w:numPr>
+        <w:spacing w:after="80"/>
+      </w:pPr>
+      <w:r>
+        <w:rPr>
+          <w:rFonts w:ascii="Microsoft JhengHei" w:cs="Microsoft JhengHei" w:eastAsia="Microsoft JhengHei" w:hAnsi="Microsoft JhengHei"/>
+          <w:b/>
+          <w:bCs/>
+          <w:sz w:val="22"/>
+          <w:szCs w:val="22"/>
+        </w:rPr>
+        <w:t xml:space="preserve">非保險生態圈收購＝買客戶接觸點</w:t>
+      </w:r>
+      <w:r>
+        <w:rPr>
+          <w:rFonts w:ascii="Microsoft JhengHei" w:cs="Microsoft JhengHei" w:eastAsia="Microsoft JhengHei" w:hAnsi="Microsoft JhengHei"/>
+          <w:sz w:val="22"/>
+          <w:szCs w:val="22"/>
+        </w:rPr>
+        <w:t xml:space="preserve">：第一生命 2024/5 以總額約 2,920 億円完全子會社化 Benefit One（中途與 M3 對抗 TOB、加價至每股 2,173 円勝出）——買的是企業福利平台的高頻 B2B2E 接點；中計明示「從保險業進化為保險服務業」「取得非保險領域的事業規模」。同社 2023 年收購寵物險 ipet（金額未複驗，引用前需查）。定位：這是 P08「低頻保單變高頻關係」的購併放大版——與其自建服務慢慢養，直接買下高頻接點。</w:t>
+      </w:r>
+    </w:p>
+    <w:p>
+      <w:pPr>
+        <w:pStyle w:val="ListParagraph"/>
+        <w:numPr>
+          <w:ilvl w:val="0"/>
+          <w:numId w:val="2"/>
+        </w:numPr>
+        <w:spacing w:after="80"/>
+      </w:pPr>
+      <w:r>
+        <w:rPr>
+          <w:rFonts w:ascii="Microsoft JhengHei" w:cs="Microsoft JhengHei" w:eastAsia="Microsoft JhengHei" w:hAnsi="Microsoft JhengHei"/>
+          <w:b/>
+          <w:bCs/>
+          <w:sz w:val="22"/>
+          <w:szCs w:val="22"/>
+        </w:rPr>
+        <w:t xml:space="preserve">保險×資管雙引擎＝資產運用本身變成事業</w:t>
+      </w:r>
+      <w:r>
+        <w:rPr>
+          <w:rFonts w:ascii="Microsoft JhengHei" w:cs="Microsoft JhengHei" w:eastAsia="Microsoft JhengHei" w:hAnsi="Microsoft JhengHei"/>
+          <w:sz w:val="22"/>
+          <w:szCs w:val="22"/>
+        </w:rPr>
+        <w:t xml:space="preserve">：第一生命 2024/3 出資美國另類資產（私募信貸）運用公司 Canyon Partners 19.9%、2027 年後有權增持過半。日生的 Resolution Life 本質同條線——封閉保單簿的整併者，賺「用資產運用能力管理他人舊保單」的錢；Corebridge 出資亦附帶資管協業。對台灣的意義：壽險資金規模是既有優勢，「保險資本＋另類資產管理能力」是全球同業共同的第二引擎。</w:t>
+      </w:r>
+    </w:p>
+    <w:p>
+      <w:pPr>
+        <w:pStyle w:val="ListParagraph"/>
+        <w:numPr>
+          <w:ilvl w:val="0"/>
+          <w:numId w:val="2"/>
+        </w:numPr>
+        <w:spacing w:after="80"/>
+      </w:pPr>
+      <w:r>
+        <w:rPr>
+          <w:rFonts w:ascii="Microsoft JhengHei" w:cs="Microsoft JhengHei" w:eastAsia="Microsoft JhengHei" w:hAnsi="Microsoft JhengHei"/>
+          <w:b/>
+          <w:bCs/>
+          <w:sz w:val="22"/>
+          <w:szCs w:val="22"/>
+        </w:rPr>
+        <w:t xml:space="preserve">收攏句</w:t>
+      </w:r>
+      <w:r>
+        <w:rPr>
+          <w:rFonts w:ascii="Microsoft JhengHei" w:cs="Microsoft JhengHei" w:eastAsia="Microsoft JhengHei" w:hAnsi="Microsoft JhengHei"/>
+          <w:sz w:val="22"/>
+          <w:szCs w:val="22"/>
+        </w:rPr>
+        <w:t xml:space="preserve">：本簡報聚焦第一個市場是刻意選擇，不是視野缺口；海外與資管兩條線牽涉資本、匯率與監理條件，與台灣可比性須另案評估——今天先把高齡市場這條講透。</w:t>
       </w:r>
     </w:p>
     <w:p>

</xml_diff>

<commit_message>
Clarify Asahi Life anshin-kaigo series scope in P07 backup notes
Co-Authored-By: Claude Fable 5 <noreply@anthropic.com>
Claude-Session: https://claude.ai/code/session_01YGzA3WbaeUwMCybbhbMuHW
</commit_message>
<xml_diff>
--- a/工作會報講稿v3_對應交人資版v2.docx
+++ b/工作會報講稿v3_對應交人資版v2.docx
@@ -1125,7 +1125,25 @@
           <w:sz w:val="22"/>
           <w:szCs w:val="22"/>
         </w:rPr>
-        <w:t xml:space="preserve">第二家佐證：朝日生命あんしん介護系列 2023/10 累計破 100 萬件。</w:t>
+        <w:t xml:space="preserve">第二家佐證：朝日生命あんしん介護系列 2023/10 累計破 100 萬件。口徑註記：主力商品「あんしん介護」是純看護險（2012 年上市、保障連動公的介護「要介護認定」）；但 100 萬件是</w:t>
+      </w:r>
+      <w:r>
+        <w:rPr>
+          <w:rFonts w:ascii="Microsoft JhengHei" w:cs="Microsoft JhengHei" w:eastAsia="Microsoft JhengHei" w:hAnsi="Microsoft JhengHei"/>
+          <w:b/>
+          <w:bCs/>
+          <w:sz w:val="22"/>
+          <w:szCs w:val="22"/>
+        </w:rPr>
+        <w:t xml:space="preserve">系列合計</w:t>
+      </w:r>
+      <w:r>
+        <w:rPr>
+          <w:rFonts w:ascii="Microsoft JhengHei" w:cs="Microsoft JhengHei" w:eastAsia="Microsoft JhengHei" w:hAnsi="Microsoft JhengHei"/>
+          <w:sz w:val="22"/>
+          <w:szCs w:val="22"/>
+        </w:rPr>
+        <w:t xml:space="preserve">——含あんしん介護認知症保険（失智）與要支援保険，非單一純看護商品數，口徑邏輯同太陽生命的「失智相關商品合計」。</w:t>
       </w:r>
     </w:p>
     <w:p>

</xml_diff>